<commit_message>
court(nyappterm): amicus-brief gated; opening's CPLR 5531 statement before the tables (page i, in the contents, items numbered), covers set the argument notice beside the calendar number or mark the appeal submitted (fb-595.54.76)
Co-Authored-By: Claude Opus 5.5 <noreply@anthropic.com>
</commit_message>
<xml_diff>
--- a/courts/second-circuit/new-york/state/appellate-terms-of-the-supreme-court/amicus-brief/usage/OUTPUT-amicus-brief.docx
+++ b/courts/second-circuit/new-york/state/appellate-terms-of-the-supreme-court/amicus-brief/usage/OUTPUT-amicus-brief.docx
@@ -1805,10 +1805,7 @@
         <w:ind w:left="2160" w:right="560" w:hanging="720"/>
       </w:pPr>
       <w:r>
-        <w:t xml:space="preserve">A.</w:t>
-      </w:r>
-      <w:r>
-        <w:t xml:space="preserve"> </w:t>
+        <w:t xml:space="preserve">A. </w:t>
       </w:r>
       <w:r>
         <w:t xml:space="preserve">Twitter.</w:t>
@@ -1833,10 +1830,7 @@
         <w:ind w:left="2160" w:right="560" w:hanging="720"/>
       </w:pPr>
       <w:r>
-        <w:t xml:space="preserve">B.</w:t>
-      </w:r>
-      <w:r>
-        <w:t xml:space="preserve"> </w:t>
+        <w:t xml:space="preserve">B. </w:t>
       </w:r>
       <w:r>
         <w:t xml:space="preserve">The</w:t>
@@ -1885,10 +1879,7 @@
         <w:ind w:left="2160" w:right="560" w:hanging="720"/>
       </w:pPr>
       <w:r>
-        <w:t xml:space="preserve">C.</w:t>
-      </w:r>
-      <w:r>
-        <w:t xml:space="preserve"> </w:t>
+        <w:t xml:space="preserve">C. </w:t>
       </w:r>
       <w:r>
         <w:t xml:space="preserve">Procedural</w:t>
@@ -1941,10 +1932,7 @@
         <w:ind w:left="1440" w:right="560" w:hanging="720"/>
       </w:pPr>
       <w:r>
-        <w:t xml:space="preserve">I.</w:t>
-      </w:r>
-      <w:r>
-        <w:t xml:space="preserve"> </w:t>
+        <w:t xml:space="preserve">I. </w:t>
       </w:r>
       <w:r>
         <w:t xml:space="preserve">HARRIS</w:t>
@@ -2059,10 +2047,7 @@
         <w:ind w:left="2160" w:right="560" w:hanging="720"/>
       </w:pPr>
       <w:r>
-        <w:t xml:space="preserve">A.</w:t>
-      </w:r>
-      <w:r>
-        <w:t xml:space="preserve"> </w:t>
+        <w:t xml:space="preserve">A. </w:t>
       </w:r>
       <w:r>
         <w:t xml:space="preserve">Twitter</w:t>
@@ -2165,10 +2150,7 @@
         <w:ind w:left="2160" w:right="560" w:hanging="720"/>
       </w:pPr>
       <w:r>
-        <w:t xml:space="preserve">B.</w:t>
-      </w:r>
-      <w:r>
-        <w:t xml:space="preserve"> </w:t>
+        <w:t xml:space="preserve">B. </w:t>
       </w:r>
       <w:r>
         <w:t xml:space="preserve">The</w:t>
@@ -2235,10 +2217,7 @@
         <w:ind w:left="1440" w:right="560" w:hanging="720"/>
       </w:pPr>
       <w:r>
-        <w:t xml:space="preserve">II.</w:t>
-      </w:r>
-      <w:r>
-        <w:t xml:space="preserve"> </w:t>
+        <w:t xml:space="preserve">II. </w:t>
       </w:r>
       <w:r>
         <w:t xml:space="preserve">THE</w:t>
@@ -2359,10 +2338,7 @@
         <w:ind w:left="1440" w:right="560" w:hanging="720"/>
       </w:pPr>
       <w:r>
-        <w:t xml:space="preserve">III.</w:t>
-      </w:r>
-      <w:r>
-        <w:t xml:space="preserve"> </w:t>
+        <w:t xml:space="preserve">III. </w:t>
       </w:r>
       <w:r>
         <w:t xml:space="preserve">THE</w:t>
@@ -2483,10 +2459,7 @@
         <w:ind w:left="2160" w:right="560" w:hanging="720"/>
       </w:pPr>
       <w:r>
-        <w:t xml:space="preserve">A.</w:t>
-      </w:r>
-      <w:r>
-        <w:t xml:space="preserve"> </w:t>
+        <w:t xml:space="preserve">A. </w:t>
       </w:r>
       <w:r>
         <w:t xml:space="preserve">Individuals</w:t>
@@ -2589,10 +2562,7 @@
         <w:ind w:left="2160" w:right="560" w:hanging="720"/>
       </w:pPr>
       <w:r>
-        <w:t xml:space="preserve">B.</w:t>
-      </w:r>
-      <w:r>
-        <w:t xml:space="preserve"> </w:t>
+        <w:t xml:space="preserve">B. </w:t>
       </w:r>
       <w:r>
         <w:t xml:space="preserve">Harris’s</w:t>
@@ -2725,10 +2695,7 @@
         <w:ind w:left="2880" w:right="560" w:hanging="720"/>
       </w:pPr>
       <w:r>
-        <w:t xml:space="preserve">1.</w:t>
-      </w:r>
-      <w:r>
-        <w:t xml:space="preserve"> </w:t>
+        <w:t xml:space="preserve">1. </w:t>
       </w:r>
       <w:r>
         <w:t xml:space="preserve">The</w:t>
@@ -2843,10 +2810,7 @@
         <w:ind w:left="2880" w:right="560" w:hanging="720"/>
       </w:pPr>
       <w:r>
-        <w:t xml:space="preserve">2.</w:t>
-      </w:r>
-      <w:r>
-        <w:t xml:space="preserve"> </w:t>
+        <w:t xml:space="preserve">2. </w:t>
       </w:r>
       <w:r>
         <w:t xml:space="preserve">The</w:t>
@@ -10365,7 +10329,7 @@
           <w:tab w:val="right" w:leader="dot" w:pos="9360"/>
         </w:tabs>
         <w:spacing w:before="196" w:after="0" w:line="322" w:lineRule="exact"/>
-        <w:ind w:left="504" w:right="4900" w:hanging="504"/>
+        <w:ind w:left="504" w:right="5320" w:hanging="504"/>
       </w:pPr>
       <w:r>
         <w:rPr>
@@ -10436,7 +10400,7 @@
         <w:tab/>
       </w:r>
       <w:r>
-        <w:t xml:space="preserve">25, 26, 36, 37, 38, 40, 41, 45, 46, 47, 48, 49</w:t>
+        <w:t xml:space="preserve">25, 26, 36, 37, 38, 39, 40, 41, 45, 46, 47, 48, 49</w:t>
       </w:r>
     </w:p>
     <w:p>
@@ -13266,9 +13230,9 @@
         <w:t xml:space="preserve"> </w:t>
       </w:r>
       <w:r>
-        <w:t xml:space="preserve">http://pewinternet.org/​Reports/2012/​Twitter-Use</w:t>
+        <w:t xml:space="preserve">http://​pewinternet.​org/​Reports/​2012/​Twitter-​Use</w:t>
         <w:noBreakHyphen/>
-        <w:t xml:space="preserve">2012.aspx</w:t>
+        <w:t xml:space="preserve">2012.​aspx</w:t>
       </w:r>
       <w:r>
         <w:t xml:space="preserve">   </w:t>
@@ -13640,7 +13604,7 @@
         <w:t xml:space="preserve"> </w:t>
       </w:r>
       <w:r>
-        <w:t xml:space="preserve">http://www.alexa.com/​topsites</w:t>
+        <w:t xml:space="preserve">http://​www.​alexa.​com/​topsites</w:t>
       </w:r>
       <w:r>
         <w:t xml:space="preserve"> </w:t>
@@ -14031,6 +13995,10 @@
         <w:t xml:space="preserve">A.</w:t>
       </w:r>
       <w:r>
+        <w:rPr>
+          <w:b/>
+          <w:bCs/>
+        </w:rPr>
         <w:tab/>
       </w:r>
       <w:r>
@@ -14207,6 +14175,10 @@
         <w:t xml:space="preserve">B.</w:t>
       </w:r>
       <w:r>
+        <w:rPr>
+          <w:b/>
+          <w:bCs/>
+        </w:rPr>
         <w:tab/>
       </w:r>
       <w:r>
@@ -14324,6 +14296,10 @@
         <w:t xml:space="preserve">C.</w:t>
       </w:r>
       <w:r>
+        <w:rPr>
+          <w:b/>
+          <w:bCs/>
+        </w:rPr>
         <w:tab/>
       </w:r>
       <w:r>
@@ -14373,13 +14349,7 @@
         <w:t xml:space="preserve"> </w:t>
       </w:r>
       <w:r>
-        <w:t xml:space="preserve">Twitter account and that he posted tweets from that account contradicting his anticipated defense on the day of the incident. Aff. in Supp. of People’s Resp. to Def.’s Mot. to Quash, at ¶¶ 9</w:t>
-      </w:r>
-      <w:r>
-        <w:noBreakHyphen/>
-      </w:r>
-      <w:r>
-        <w:t xml:space="preserve">11.</w:t>
+        <w:t xml:space="preserve">Twitter account and that he posted tweets from that account contradicting his anticipated defense on the day of the incident. Aff. in Supp. of People’s Resp. to Def.’s Mot. to Quash, at ¶¶ 9-⁠11.</w:t>
       </w:r>
     </w:p>
     <w:p>
@@ -14484,6 +14454,10 @@
         <w:t xml:space="preserve">I.</w:t>
       </w:r>
       <w:r>
+        <w:rPr>
+          <w:b/>
+          <w:bCs/>
+        </w:rPr>
         <w:tab/>
       </w:r>
       <w:r>
@@ -14746,6 +14720,10 @@
         <w:t xml:space="preserve">A.</w:t>
       </w:r>
       <w:r>
+        <w:rPr>
+          <w:b/>
+          <w:bCs/>
+        </w:rPr>
         <w:tab/>
       </w:r>
       <w:r>
@@ -15590,7 +15568,7 @@
         <w:t xml:space="preserve">In re Grand Jury</w:t>
       </w:r>
       <w:r>
-        <w:t xml:space="preserve">, 111 F.3d 1066, 1072 (3d Cir. 1997) (“Because it is Doe 1 and Doe 2 whose privacy has been violated and would again be violated by compliance with the [grand jury] subpoena . . . it is the intervenors and not the witness herself who are best suited to assert the Title III claim.”). Although the information requested may be in Twitter’s possession, the First Amendment interests at stake belong primarily to Harris, and Harris’s rights are best raised by Harris, not by Twitter.</w:t>
+        <w:t xml:space="preserve">, 111 F.3d 1066, 1072 (3d Cir. 1997) (“Because it is Doe 1 and Doe 2 whose privacy has been violated and would again be violated by compliance with the [grand jury] subpoena . . . it is the intervenors and not the witness herself who are best suited to assert the Title III claim.”). Although the information requested may be in Twitter’s possession, the First Amendment interests at stake belong primarily to Harris, and Harris’s rights are best raised by Harris, not by Twitter.</w:t>
       </w:r>
       <w:r>
         <w:rPr>
@@ -15615,6 +15593,10 @@
         <w:t xml:space="preserve">B.</w:t>
       </w:r>
       <w:r>
+        <w:rPr>
+          <w:b/>
+          <w:bCs/>
+        </w:rPr>
         <w:tab/>
       </w:r>
       <w:r>
@@ -16203,7 +16185,7 @@
         <w:t xml:space="preserve">People v. Weaver</w:t>
       </w:r>
       <w:r>
-        <w:t xml:space="preserve">, 12 N.Y.3d 433, 442 [2009] (holding that GPS monitoring reveals “a highly detailed profile, not simply of where we go, but by easy inference, of our associations . . . and of the pattern of our professional and avocational pursuits”).</w:t>
+        <w:t xml:space="preserve">, 12 N.Y.3d 433, 442 [2009] (holding that GPS monitoring reveals “a highly detailed profile, not simply of where we go, but by easy inference, of our associations . . . and of the pattern of our professional and avocational pursuits”).</w:t>
       </w:r>
       <w:r>
         <w:rPr>
@@ -16470,6 +16452,10 @@
         <w:t xml:space="preserve">II.</w:t>
       </w:r>
       <w:r>
+        <w:rPr>
+          <w:b/>
+          <w:bCs/>
+        </w:rPr>
         <w:tab/>
       </w:r>
       <w:r>
@@ -16736,7 +16722,7 @@
         <w:t xml:space="preserve">v. Fla. Legislative Investigation Comm.</w:t>
       </w:r>
       <w:r>
-        <w:t xml:space="preserve">, 372 U.S. 539, 546 (1963) (holding that a state legislative committee subpoena could not be enforced because “it is an essential prerequisite to the validity of an investigation which intrudes into the area of constitutionally protected rights of speech . . . that the State convincingly show a substantial relation between the information sought and a subject of overriding and compelling state interest”);</w:t>
+        <w:t xml:space="preserve">, 372 U.S. 539, 546 (1963) (holding that a state legislative committee subpoena could not be enforced because “it is an essential prerequisite to the validity of an investigation which intrudes into the area of constitutionally protected rights of speech . . . that the State convincingly show a substantial relation between the information sought and a subject of overriding and compelling state interest”);</w:t>
       </w:r>
       <w:r>
         <w:t xml:space="preserve"> </w:t>
@@ -17043,6 +17029,10 @@
         <w:t xml:space="preserve">III.</w:t>
       </w:r>
       <w:r>
+        <w:rPr>
+          <w:b/>
+          <w:bCs/>
+        </w:rPr>
         <w:tab/>
       </w:r>
       <w:r>
@@ -17314,6 +17304,10 @@
         <w:t xml:space="preserve">A.</w:t>
       </w:r>
       <w:r>
+        <w:rPr>
+          <w:b/>
+          <w:bCs/>
+        </w:rPr>
         <w:tab/>
       </w:r>
       <w:r>
@@ -17581,7 +17575,7 @@
         <w:t xml:space="preserve">Weaver</w:t>
       </w:r>
       <w:r>
-        <w:t xml:space="preserve">, the Court took a step further—one not previously taken by the United States Supreme Court—to recognize that even when the movements take place in public, “[t]he whole of a person’s progress through the world” will reveal “with breathtaking quality and quantity . . . a highly detailed profile, not simply of where we go, but by easy inference, of our associations—political, religious, amicable and amorous, to name only a few—and of the pattern of our professional and avocational pursuits.”</w:t>
+        <w:t xml:space="preserve">, the Court took a step further—one not previously taken by the United States Supreme Court—to recognize that even when the movements take place in public, “[t]he whole of a person’s progress through the world” will reveal “with breathtaking quality and quantity . . . a highly detailed profile, not simply of where we go, but by easy inference, of our associations—political, religious, amicable and amorous, to name only a few—and of the pattern of our professional and avocational pursuits.”</w:t>
       </w:r>
       <w:r>
         <w:t xml:space="preserve"> </w:t>
@@ -17672,7 +17666,7 @@
         <w:t xml:space="preserve"> </w:t>
       </w:r>
       <w:r>
-        <w:t xml:space="preserve">concurring opinions—that government cannot engage in long-term surveillance of a person’s locations and movements without a warrant—applies to any technology, like IP address tracking, that “facilitates a new . . . perception of the world in which the situation of an object may be followed and exhaustively recorded over . . . a practically unlimited period.”</w:t>
+        <w:t xml:space="preserve">concurring opinions—that government cannot engage in long-term surveillance of a person’s locations and movements without a warrant—applies to any technology, like IP address tracking, that “facilitates a new . . . perception of the world in which the situation of an object may be followed and exhaustively recorded over . . . a practically unlimited period.”</w:t>
       </w:r>
       <w:r>
         <w:t xml:space="preserve"> </w:t>
@@ -17943,6 +17937,10 @@
         <w:t xml:space="preserve">B.</w:t>
       </w:r>
       <w:r>
+        <w:rPr>
+          <w:b/>
+          <w:bCs/>
+        </w:rPr>
         <w:tab/>
       </w:r>
       <w:r>
@@ -18223,6 +18221,12 @@
         <w:t xml:space="preserve">1.</w:t>
       </w:r>
       <w:r>
+        <w:rPr>
+          <w:b/>
+          <w:bCs/>
+          <w:i/>
+          <w:iCs/>
+        </w:rPr>
         <w:tab/>
       </w:r>
       <w:r>
@@ -18881,7 +18885,7 @@
         <w:t xml:space="preserve">EDNY Garaufis Opinion</w:t>
       </w:r>
       <w:r>
-        <w:t xml:space="preserve">, 809 F. Supp. 2d at 125. Because location records “implicate sufficiently serious protected privacy concerns . . . an exception to the third-party-disclosure doctrine should apply to them, as it does to content, to prohibit undue governmental intrusion.” Id. at 126;</w:t>
+        <w:t xml:space="preserve">, 809 F. Supp. 2d at 125. Because location records “implicate sufficiently serious protected privacy concerns . . . an exception to the third-party-disclosure doctrine should apply to them, as it does to content, to prohibit undue governmental intrusion.” Id. at 126;</w:t>
       </w:r>
       <w:r>
         <w:t xml:space="preserve"> </w:t>
@@ -18908,7 +18912,7 @@
         <w:t xml:space="preserve">the Release of Historical Cell-Site Info.</w:t>
       </w:r>
       <w:r>
-        <w:t xml:space="preserve">, No. 10 MC 0897, 2010 WL 5437209, at *3 (E.D.N.Y. Dec. 23, 2010) (Orenstein, Mag. J.) (holding that the third-party doctrine should not apply to location records because “location information is not a simple business record and . . . it can effectively convey details that reveal the most sensitive information about a person’s life”). This Court should conclude the same as to IP addresses that similarly reveal location and movement information.</w:t>
+        <w:t xml:space="preserve">, No. 10 MC 0897, 2010 WL 5437209, at *3 (E.D.N.Y. Dec. 23, 2010) (Orenstein, Mag. J.) (holding that the third-party doctrine should not apply to location records because “location information is not a simple business record and . . . it can effectively convey details that reveal the most sensitive information about a person’s life”). This Court should conclude the same as to IP addresses that similarly reveal location and movement information.</w:t>
       </w:r>
     </w:p>
     <w:p>
@@ -19075,6 +19079,12 @@
         <w:t xml:space="preserve">2.</w:t>
       </w:r>
       <w:r>
+        <w:rPr>
+          <w:b/>
+          <w:bCs/>
+          <w:i/>
+          <w:iCs/>
+        </w:rPr>
         <w:tab/>
       </w:r>
       <w:r>
@@ -21249,7 +21259,7 @@
         <w:t xml:space="preserve">Washington Post, July 30, 2012</w:t>
       </w:r>
       <w:r>
-        <w:t xml:space="preserve">, http://​​www.​washingtonpost.​com/​​business/​​technology/​​twitter-​reaches</w:t>
+        <w:t xml:space="preserve">, http://​www.​washingtonpost.​com/​business/​technology/​twitter-​reaches</w:t>
       </w:r>
       <w:r>
         <w:noBreakHyphen/>
@@ -21261,7 +21271,7 @@
         <w:noBreakHyphen/>
       </w:r>
       <w:r>
-        <w:t xml:space="preserve">140-​million-​in-​theus/​​2012/​​07/​​30/​​gJQAVdIMLX_story.​html?Post+generic=%3Ftid%3Dsm_twitter_washingtonpost.</w:t>
+        <w:t xml:space="preserve">140-​million-​in-​theus/​2012/​07/​30/​gJQAVdIMLX_story.​html?​Post+generic=%3Ftid%3Dsm_twitter_washingtonpost.</w:t>
       </w:r>
     </w:p>
   </w:footnote>
@@ -21298,7 +21308,7 @@
           <w:i/>
           <w:iCs/>
         </w:rPr>
-        <w:t xml:space="preserve">Alexa, http://​​​www.​alexa.​com/​​​topsites (last visited Aug. 22, 2012)</w:t>
+        <w:t xml:space="preserve">Alexa, http://​www.​alexa.​com/​topsites (last visited Aug. 22, 2012)</w:t>
       </w:r>
       <w:r>
         <w:t xml:space="preserve">; see also</w:t>
@@ -21328,7 +21338,7 @@
         <w:t xml:space="preserve">Pew Internet &amp; American Life Project (May 2012)</w:t>
       </w:r>
       <w:r>
-        <w:t xml:space="preserve">, http://​​pewinternet.​org/​​Reports/​​2012/​​Twitter-​Use</w:t>
+        <w:t xml:space="preserve">, http://​pewinternet.​org/​Reports/​2012/​Twitter-​Use</w:t>
       </w:r>
       <w:r>
         <w:noBreakHyphen/>
@@ -21353,7 +21363,7 @@
         <w:t xml:space="preserve"> </w:t>
       </w:r>
       <w:r>
-        <w:t xml:space="preserve">Neil MacFarquhar, Social Media Help Keep the Door Open to Sustained Dissent Inside Saudi Arabia, N.Y. Times, June 15, 2011, http://​​www.​nytimes.​com/​​2011/​​06/​​16/​​world/​​middleeast/​​16saudi.​html.</w:t>
+        <w:t xml:space="preserve">Neil MacFarquhar, Social Media Help Keep the Door Open to Sustained Dissent Inside Saudi Arabia, N.Y. Times, June 15, 2011, http://​www.​nytimes.​com/​2011/​06/​16/​world/​middleeast/​16saudi.​html.</w:t>
       </w:r>
     </w:p>
   </w:footnote>
@@ -21586,7 +21596,7 @@
         <w:t xml:space="preserve">In re Grand Jury</w:t>
       </w:r>
       <w:r>
-        <w:t xml:space="preserve">, 111 F.3d 1066, 1073 (3d Cir. 1997) (“The Supreme Court and this court have on several occasions allowed third parties to move to quash grand jury subpoenas directed to others. . . . It is well-established that a litigant may have sufficiently important, legally-cognizable interests in the materials or testimony sought by a grand jury subpoena issued to another person to give the litigant standing to challenge the validity of that subpoena.”) (listing and discussing cases);</w:t>
+        <w:t xml:space="preserve">, 111 F.3d 1066, 1073 (3d Cir. 1997) (“The Supreme Court and this court have on several occasions allowed third parties to move to quash grand jury subpoenas directed to others. . . . It is well-established that a litigant may have sufficiently important, legally-cognizable interests in the materials or testimony sought by a grand jury subpoena issued to another person to give the litigant standing to challenge the validity of that subpoena.”) (listing and discussing cases);</w:t>
       </w:r>
       <w:r>
         <w:t xml:space="preserve"> </w:t>
@@ -23059,6 +23069,33 @@
       <w:ind w:left="2160" w:hanging="720"/>
     </w:pPr>
   </w:style>
+  <w:style w:type="paragraph" w:customStyle="1" w:styleId="XdQuoteList1">
+    <w:name w:val="Xd Quote List 1"/>
+    <w:basedOn w:val="Normal"/>
+    <w:qFormat/>
+    <w:pPr>
+      <w:spacing w:before="0" w:after="0" w:line="322" w:lineRule="exact"/>
+      <w:ind w:left="1440" w:right="720" w:hanging="720"/>
+    </w:pPr>
+  </w:style>
+  <w:style w:type="paragraph" w:customStyle="1" w:styleId="XdQuoteList2">
+    <w:name w:val="Xd Quote List 2"/>
+    <w:basedOn w:val="Normal"/>
+    <w:qFormat/>
+    <w:pPr>
+      <w:spacing w:before="0" w:after="0" w:line="322" w:lineRule="exact"/>
+      <w:ind w:left="2160" w:right="720" w:hanging="720"/>
+    </w:pPr>
+  </w:style>
+  <w:style w:type="paragraph" w:customStyle="1" w:styleId="XdQuoteList3">
+    <w:name w:val="Xd Quote List 3"/>
+    <w:basedOn w:val="Normal"/>
+    <w:qFormat/>
+    <w:pPr>
+      <w:spacing w:before="0" w:after="0" w:line="322" w:lineRule="exact"/>
+      <w:ind w:left="2880" w:right="720" w:hanging="720"/>
+    </w:pPr>
+  </w:style>
   <w:style w:type="paragraph" w:customStyle="1" w:styleId="XdQuoteOnly">
     <w:name w:val="XdQuoteOnly"/>
     <w:basedOn w:val="BodyText"/>

</xml_diff>